<commit_message>
Release v0.6.0 metadata (MIT LICENSE, .zenodo.json, CITATION.cff); App Note review corrections; v57 Funding statement
Co-Authored-By: Claude Opus 5.5 <noreply@anthropic.com>
</commit_message>
<xml_diff>
--- a/manuscript/appnote/scJDO2_flow_appnote.docx
+++ b/manuscript/appnote/scJDO2_flow_appnote.docx
@@ -64,7 +64,7 @@
         <w:t xml:space="preserve"> </w:t>
       </w:r>
       <w:r>
-        <w:t xml:space="preserve">Local Jacobians of single-cell dynamics are used to find cells near fate decisions, but they require a velocity, and splicing or metabolic-labeling velocities are often unavailable or disagree with each other. Many single-cell studies have sampling times. No tool turns sampling times alone into a per-cell dynamical operator in one step, together with evidence of what that operator can and cannot identify.</w:t>
+        <w:t xml:space="preserve">Local Jacobians of single-cell dynamics are used to find cells near fate decisions, but they require a velocity, and splicing or metabolic-labeling velocities are often unavailable or disagree with each other. Many single-cell studies have sampling times. Methods that learn dynamics from time courses exist, but to our knowledge no widely used tool returns a per-cell dynamical operator from sampling times alone in one call, in AnnData format, with documented diagnostics of what the operator does and does not identify.</w:t>
       </w:r>
     </w:p>
     <w:p>
@@ -94,7 +94,7 @@
         <w:t xml:space="preserve">scjdo2.flow</w:t>
       </w:r>
       <w:r>
-        <w:t xml:space="preserve">, a single call that estimates a velocity by entropic optimal transport between sampling times, fits a smooth drift and returns the per-cell flow operator, its leading eigenvalue λ₁ and magnitude-free operator-space descriptors in an AnnData object. With a-priori settings, λ₁ ranked fate-bifurcation cells above committed cells on held-out synthetic data (AUC 0.89–1.00). On LARRY lineage-traced hematopoiesis, the fitted drift predicted each barcoded cell’s clonal displacement beyond population movement and a held-out sampling day better than baselines. Mini-batch transport ran on all 130,887 cells in 26 min with a peak memory of 2.5 GB. The operator does not recover the values of the true Jacobian and depends on the embedding metric; the documentation states how to use it.</w:t>
+        <w:t xml:space="preserve">, a single call that estimates a velocity by entropic optimal transport between sampling times, fits a smooth drift and returns the per-cell flow operator, its leading eigenvalue λ₁ (largest real part) and magnitude-free operator-space descriptors in an AnnData object. With a-priori settings, λ₁ ranked fate-bifurcation cells above committed cells on held-out synthetic data (AUC 0.89–1.00). On LARRY lineage-traced hematopoiesis, the fitted drift predicted each barcoded cell’s clonal displacement beyond population movement and a held-out sampling day better than baselines. Mini-batch transport ran on all 130,887 cells in ≈ 26 min in total with a peak memory of 2.5 GB. The operator does not recover the values of the true Jacobian and depends on the transport metric; the documented default is a variance-weighted PCA with 10–20 components.</w:t>
       </w:r>
     </w:p>
     <w:p>
@@ -494,13 +494,86 @@
       <w:r>
         <w:t xml:space="preserve"> </w:t>
       </w:r>
-      <w:r>
-        <w:rPr>
-          <w:i/>
-          <w:iCs/>
-        </w:rPr>
-        <w:t xml:space="preserve">J_flow(z) = ∂f/∂z</w:t>
-      </w:r>
+      <m:oMath>
+        <m:sSub>
+          <m:e>
+            <m:r>
+              <m:t>J</m:t>
+            </m:r>
+          </m:e>
+          <m:sub>
+            <m:r>
+              <m:rPr>
+                <m:sty m:val="p"/>
+              </m:rPr>
+              <m:t>f</m:t>
+            </m:r>
+            <m:r>
+              <m:rPr>
+                <m:sty m:val="p"/>
+              </m:rPr>
+              <m:t>l</m:t>
+            </m:r>
+            <m:r>
+              <m:rPr>
+                <m:sty m:val="p"/>
+              </m:rPr>
+              <m:t>o</m:t>
+            </m:r>
+            <m:r>
+              <m:rPr>
+                <m:sty m:val="p"/>
+              </m:rPr>
+              <m:t>w</m:t>
+            </m:r>
+          </m:sub>
+        </m:sSub>
+        <m:r>
+          <m:rPr>
+            <m:sty m:val="p"/>
+          </m:rPr>
+          <m:t>(</m:t>
+        </m:r>
+        <m:r>
+          <m:t>z</m:t>
+        </m:r>
+        <m:r>
+          <m:rPr>
+            <m:sty m:val="p"/>
+          </m:rPr>
+          <m:t>)</m:t>
+        </m:r>
+        <m:r>
+          <m:rPr>
+            <m:sty m:val="p"/>
+          </m:rPr>
+          <m:t>=</m:t>
+        </m:r>
+        <m:r>
+          <m:rPr>
+            <m:sty m:val="p"/>
+          </m:rPr>
+          <m:t>∂</m:t>
+        </m:r>
+        <m:r>
+          <m:t>f</m:t>
+        </m:r>
+        <m:r>
+          <m:rPr>
+            <m:sty m:val="p"/>
+          </m:rPr>
+          <m:t>/</m:t>
+        </m:r>
+        <m:r>
+          <m:rPr>
+            <m:sty m:val="p"/>
+          </m:rPr>
+          <m:t>∂</m:t>
+        </m:r>
+        <m:r>
+          <m:t>z</m:t>
+        </m:r>
+      </m:oMath>
       <w:r>
         <w:t xml:space="preserve"> </w:t>
       </w:r>
@@ -532,7 +605,7 @@
         <w:t xml:space="preserve"> </w:t>
       </w:r>
       <w:r>
-        <w:t xml:space="preserve">λ₁ (largest real part) and eight magnitude-free descriptors are returned, rank-transformed within the dataset: six functions of the eigenvalues (sign of Re λ₁, number of eigenvalues with positive real part, Re λ₁/max|λ|, rotational index max|Im λ|/max|λ|, spectral gap and trace normalized by the spectrum), which are invariant under any linear change of coordinates, and Henrici non-normality and transient gain, which are invariant only under orthogonal changes.</w:t>
+        <w:t xml:space="preserve">λ₁ and eight magnitude-free descriptors are returned, rank-transformed within the dataset: six functions of the eigenvalues (sign of Re λ₁, number of eigenvalues with positive real part, Re λ₁/max|λ|, rotational index max|Im λ|/max|λ|, spectral gap and trace normalized by the spectrum), which are invariant under any linear change of coordinates, and Henrici non-normality and transient gain, which are invariant only under orthogonal changes.</w:t>
       </w:r>
     </w:p>
     <w:p>
@@ -735,7 +808,7 @@
         <w:t xml:space="preserve"> </w:t>
       </w:r>
       <w:r>
-        <w:t xml:space="preserve">On a synthetic benchmark calibrated to six real datasets, λ₁ of the flow operator separated cells at the true saddle from committed cells on held-out seeds with AUC 0.89–1.00 across 10–20 components and four presets (Fig. 1b). A configuration tuned on two development seeds did worse on the same held-out seeds (0.42–0.95), so the released defaults are the untuned ones. On an independent simulator (dyngen; Cannoodt</w:t>
+        <w:t xml:space="preserve">On a synthetic benchmark calibrated to six real datasets, λ₁ of the flow operator separated cells at the true saddle from committed cells on held-out seeds with a fork AUC (area under the ROC curve of λ₁ for branch-point versus committed cells) of 0.89–1.00 across 10–20 components and four presets (Fig. 1b). A configuration tuned on two development seeds did worse on the same held-out seeds (0.42–0.95), so the released defaults are the untuned ones. On an independent simulator (dyngen; Cannoodt</w:t>
       </w:r>
       <w:r>
         <w:t xml:space="preserve"> </w:t>
@@ -766,20 +839,20 @@
         <w:t xml:space="preserve"> </w:t>
       </w:r>
       <w:r>
-        <w:t xml:space="preserve">On LARRY in vitro hematopoiesis (Weinreb</w:t>
-      </w:r>
-      <w:r>
-        <w:t xml:space="preserve"> </w:t>
-      </w:r>
-      <w:r>
-        <w:rPr>
-          <w:i/>
-          <w:iCs/>
-        </w:rPr>
-        <w:t xml:space="preserve">et al.</w:t>
-      </w:r>
-      <w:r>
-        <w:t xml:space="preserve">, 2020), integrating the drift over each 48-h interval predicted the displacement of 554 barcoded cells to the centroid of their clone at the next day (Spearman 0.56; maximum of 1,000 permutations 0.15; Fig. 1c). Agreement persisted after centring each coordinate within each interval (0.50; null maximum 0.04), whereas a population mean-shift predictor reached 0.19, so the drift captures cell-level movement beyond the population trend. λ₁ was unrelated to displacement magnitude (−0.04): lineage validates the velocity and drift, not λ₁. Fitted on days 2 and 4 only, the drift predicted the held-out day-6 distribution better than mean-displacement and no-movement baselines (energy distance 0.69, 95 % bootstrap interval 0.66–0.73, vs 0.87 [0.85–0.89] and 0.88 [0.83–0.94]; Fig. 1d).</w:t>
+        <w:t xml:space="preserve">On LARRY, a lineage-barcoded in vitro hematopoiesis time course (Weinreb</w:t>
+      </w:r>
+      <w:r>
+        <w:t xml:space="preserve"> </w:t>
+      </w:r>
+      <w:r>
+        <w:rPr>
+          <w:i/>
+          <w:iCs/>
+        </w:rPr>
+        <w:t xml:space="preserve">et al.</w:t>
+      </w:r>
+      <w:r>
+        <w:t xml:space="preserve">, 2020), integrating the drift over each 48-h interval predicted the displacement of 554 barcoded cells to the centroid of their clone at the next day (Spearman 0.56; maximum of 1,000 permutations 0.15; Fig. 1c). Agreement persisted after centring each coordinate within each interval (0.50; null maximum 0.04), whereas a population mean-shift predictor reached 0.19, so the drift captures cell-level movement beyond the population trend. λ₁ was unrelated to displacement magnitude (−0.04): lineage validates the velocity and drift, not λ₁. Fitted on days 2 and 4 only, the drift predicted the held-out day-6 distribution better than mean-displacement and no-movement baselines (energy distance, a metric between point clouds that is zero only for identical distributions; Székely and Rizzo, 2013: 0.69, 95 % bootstrap interval 0.66–0.73, vs 0.87 [0.85–0.89] and 0.88 [0.83–0.94]; Fig. 1d).</w:t>
       </w:r>
     </w:p>
     <w:p>
@@ -1825,6 +1898,40 @@
       </w:r>
       <w:r>
         <w:t xml:space="preserve">, 25–39.</w:t>
+      </w:r>
+    </w:p>
+    <w:p>
+      <w:pPr>
+        <w:pStyle w:val="BodyText"/>
+      </w:pPr>
+      <w:r>
+        <w:t xml:space="preserve">Székely, G.J. and Rizzo, M.L. (2013) Energy statistics: a class of statistics based on distances.</w:t>
+      </w:r>
+      <w:r>
+        <w:t xml:space="preserve"> </w:t>
+      </w:r>
+      <w:r>
+        <w:rPr>
+          <w:i/>
+          <w:iCs/>
+        </w:rPr>
+        <w:t xml:space="preserve">J. Stat. Plan. Inference</w:t>
+      </w:r>
+      <w:r>
+        <w:t xml:space="preserve">,</w:t>
+      </w:r>
+      <w:r>
+        <w:t xml:space="preserve"> </w:t>
+      </w:r>
+      <w:r>
+        <w:rPr>
+          <w:b/>
+          <w:bCs/>
+        </w:rPr>
+        <w:t xml:space="preserve">143</w:t>
+      </w:r>
+      <w:r>
+        <w:t xml:space="preserve">, 1249–1272.</w:t>
       </w:r>
     </w:p>
     <w:p>

</xml_diff>